<commit_message>
Add family-facing Further Reading section with BSACI/BDA/Allergy UK links
Adds a public-facing "Further reading" section (distinct from the
internal, unpublished sources note) so families can read the BSACI,
BDA and Allergy UK guidance directly. Links verified as live via
search before inclusion. Word doc regenerated with these as proper
clickable hyperlinks.

Co-Authored-By: Claude Sonnet 5 <noreply@anthropic.com>
Claude-Session: https://claude.ai/code/session_01Uqa3eyCJ5qv5EL35vZVRqm
</commit_message>
<xml_diff>
--- a/Introducing-Allergenic-Foods-Baby-Eczema.docx
+++ b/Introducing-Allergenic-Foods-Baby-Eczema.docx
@@ -1399,6 +1399,89 @@
         </w:rPr>
         <w:t xml:space="preserve">Every child deserves the best start in life.</w:t>
       </w:r>
+    </w:p>
+    <w:p>
+      <w:pPr>
+        <w:pStyle w:val="Heading2"/>
+        <w:pBdr>
+          <w:bottom w:val="single" w:color="199195" w:sz="4" w:space="3"/>
+        </w:pBdr>
+        <w:spacing w:after="120" w:before="280"/>
+      </w:pPr>
+      <w:r>
+        <w:rPr>
+          <w:color w:val="0A3437"/>
+        </w:rPr>
+        <w:t xml:space="preserve">Further reading</w:t>
+      </w:r>
+    </w:p>
+    <w:p>
+      <w:pPr>
+        <w:spacing w:after="160"/>
+      </w:pPr>
+      <w:r>
+        <w:t xml:space="preserve">This article draws on current guidance from the following organisations, where you can read the full guidance for yourself:</w:t>
+      </w:r>
+    </w:p>
+    <w:p>
+      <w:pPr>
+        <w:pStyle w:val="ListParagraph"/>
+        <w:numPr>
+          <w:ilvl w:val="0"/>
+          <w:numId w:val="1"/>
+        </w:numPr>
+        <w:spacing w:after="60"/>
+      </w:pPr>
+      <w:hyperlink w:history="1" r:id="rIdi5hmuvdvmyf8dt8qvrg_5">
+        <w:r>
+          <w:rPr>
+            <w:rStyle w:val="Hyperlink"/>
+            <w:color w:val="199195"/>
+            <w:u w:val="single"/>
+          </w:rPr>
+          <w:t xml:space="preserve">BSACI: Early introduction of food allergens</w:t>
+        </w:r>
+      </w:hyperlink>
+    </w:p>
+    <w:p>
+      <w:pPr>
+        <w:pStyle w:val="ListParagraph"/>
+        <w:numPr>
+          <w:ilvl w:val="0"/>
+          <w:numId w:val="1"/>
+        </w:numPr>
+        <w:spacing w:after="60"/>
+      </w:pPr>
+      <w:hyperlink w:history="1" r:id="rIdlepa7zazkw4vckz_eievx">
+        <w:r>
+          <w:rPr>
+            <w:rStyle w:val="Hyperlink"/>
+            <w:color w:val="199195"/>
+            <w:u w:val="single"/>
+          </w:rPr>
+          <w:t xml:space="preserve">British Dietetic Association: Complementary feeding (weaning)</w:t>
+        </w:r>
+      </w:hyperlink>
+    </w:p>
+    <w:p>
+      <w:pPr>
+        <w:pStyle w:val="ListParagraph"/>
+        <w:numPr>
+          <w:ilvl w:val="0"/>
+          <w:numId w:val="1"/>
+        </w:numPr>
+        <w:spacing w:after="60"/>
+      </w:pPr>
+      <w:hyperlink w:history="1" r:id="rIdacbhqqnhrpcimfuoesyu9">
+        <w:r>
+          <w:rPr>
+            <w:rStyle w:val="Hyperlink"/>
+            <w:color w:val="199195"/>
+            <w:u w:val="single"/>
+          </w:rPr>
+          <w:t xml:space="preserve">Allergy UK: Weaning and Introducing your Baby onto Solids</w:t>
+        </w:r>
+      </w:hyperlink>
     </w:p>
     <w:p>
       <w:pPr>

</xml_diff>